<commit_message>
AVTO-0 Changing customer application doc
</commit_message>
<xml_diff>
--- a/storage/document_files/templates/customer-application.docx
+++ b/storage/document_files/templates/customer-application.docx
@@ -1140,6 +1140,28 @@
     <w:p>
       <w:pPr>
         <w:spacing w:after="240" w:before="240" w:lineRule="auto"/>
+        <w:jc w:val="both"/>
+        <w:rPr>
+          <w:rFonts w:ascii="Times New Roman" w:cs="Times New Roman" w:eastAsia="Times New Roman" w:hAnsi="Times New Roman"/>
+          <w:sz w:val="28"/>
+          <w:szCs w:val="28"/>
+          <w:highlight w:val="white"/>
+        </w:rPr>
+      </w:pPr>
+      <w:r>
+        <w:rPr>
+          <w:rFonts w:ascii="Times New Roman" w:cs="Times New Roman" w:eastAsia="Times New Roman" w:hAnsi="Times New Roman"/>
+          <w:sz w:val="28"/>
+          <w:szCs w:val="28"/>
+          <w:highlight w:val="white"/>
+          <w:rtl w:val="0"/>
+        </w:rPr>
+        <w:t xml:space="preserve">3.2.4 Mijoz amalga oshirilgan to‘lovlar va muddatli to‘lov qarzdorligi miqdori haqida, shuningdek Shartnoma bilan bog‘liq boshqa holatlar bo‘yicha uyali aloqa vositalari orqali SMS-xabarlar yuborilishiga Sotuvchiga o‘z roziligini bildiradi.</w:t>
+      </w:r>
+    </w:p>
+    <w:p>
+      <w:pPr>
+        <w:spacing w:after="240" w:before="240" w:lineRule="auto"/>
         <w:ind w:left="0" w:firstLine="0"/>
         <w:jc w:val="both"/>
         <w:rPr>
@@ -1157,7 +1179,7 @@
           <w:highlight w:val="white"/>
           <w:rtl w:val="0"/>
         </w:rPr>
-        <w:t xml:space="preserve">3.2.4 Mijoz amalga oshirilgan to‘lovlar va muddatli to‘lov qarzdorligi miqdori haqida, shuningdek Shartnoma bilan bog‘liq boshqa holatlar bo‘yicha uyali aloqa vositalari orqali SMS-xabarlar yuborilishiga Sotuvchiga o‘z roziligini bildiradi.</w:t>
+        <w:t xml:space="preserve">3.2.5 Mijoz shaxsiy ma’lumotlarni qayta ishlashga, shuningdek qarzdorlik yoki qarzni to‘lamaslik holatida shaxsiy identifikatsion raqami bo‘yicha topilgan barcha mavjud va yangi ochiladigan to‘lov kartalaridan (Uzcard/Humo va Kobeyj kartalari) qarz mablag’larni yechib olishga o‘z roziligini berishi.</w:t>
       </w:r>
     </w:p>
     <w:p>

</xml_diff>

<commit_message>
AVTO-0 change customer agreement
</commit_message>
<xml_diff>
--- a/storage/document_files/templates/customer-application.docx
+++ b/storage/document_files/templates/customer-application.docx
@@ -200,9 +200,9 @@
           <w:szCs w:val="24"/>
           <w:lang w:val="en-US"/>
         </w:rPr>
-        <w:t>installment_id</w:t>
-      </w:r>
-      <w:proofErr w:type="spellEnd"/>
+        <w:t>installment_</w:t>
+      </w:r>
+      <w:proofErr w:type="gramStart"/>
       <w:r>
         <w:rPr>
           <w:rFonts w:ascii="Times New Roman" w:eastAsia="Times New Roman" w:hAnsi="Times New Roman" w:cs="Times New Roman"/>
@@ -211,9 +211,19 @@
           <w:szCs w:val="24"/>
           <w:lang w:val="en-US"/>
         </w:rPr>
+        <w:t>id</w:t>
+      </w:r>
+      <w:proofErr w:type="spellEnd"/>
+      <w:r>
+        <w:rPr>
+          <w:rFonts w:ascii="Times New Roman" w:eastAsia="Times New Roman" w:hAnsi="Times New Roman" w:cs="Times New Roman"/>
+          <w:b/>
+          <w:sz w:val="24"/>
+          <w:szCs w:val="24"/>
+          <w:lang w:val="en-US"/>
+        </w:rPr>
         <w:t xml:space="preserve">} </w:t>
       </w:r>
-      <w:proofErr w:type="spellStart"/>
       <w:r>
         <w:rPr>
           <w:rFonts w:ascii="Times New Roman" w:eastAsia="Times New Roman" w:hAnsi="Times New Roman" w:cs="Times New Roman"/>
@@ -222,7 +232,29 @@
           <w:szCs w:val="24"/>
           <w:lang w:val="en-US"/>
         </w:rPr>
-        <w:t>oldi-sotdi</w:t>
+        <w:t xml:space="preserve"> </w:t>
+      </w:r>
+      <w:proofErr w:type="spellStart"/>
+      <w:r>
+        <w:rPr>
+          <w:rFonts w:ascii="Times New Roman" w:eastAsia="Times New Roman" w:hAnsi="Times New Roman" w:cs="Times New Roman"/>
+          <w:b/>
+          <w:sz w:val="24"/>
+          <w:szCs w:val="24"/>
+          <w:lang w:val="en-US"/>
+        </w:rPr>
+        <w:t>oldi</w:t>
+      </w:r>
+      <w:proofErr w:type="gramEnd"/>
+      <w:r>
+        <w:rPr>
+          <w:rFonts w:ascii="Times New Roman" w:eastAsia="Times New Roman" w:hAnsi="Times New Roman" w:cs="Times New Roman"/>
+          <w:b/>
+          <w:sz w:val="24"/>
+          <w:szCs w:val="24"/>
+          <w:lang w:val="en-US"/>
+        </w:rPr>
+        <w:t>-sotdi</w:t>
       </w:r>
       <w:proofErr w:type="spellEnd"/>
       <w:r>
@@ -16795,6 +16827,8 @@
               <w:jc w:val="center"/>
               <w:rPr>
                 <w:rFonts w:ascii="Times New Roman" w:eastAsia="Times New Roman" w:hAnsi="Times New Roman" w:cs="Times New Roman"/>
+                <w:b/>
+                <w:bCs/>
                 <w:sz w:val="24"/>
                 <w:szCs w:val="24"/>
               </w:rPr>
@@ -16803,6 +16837,8 @@
             <w:r>
               <w:rPr>
                 <w:rFonts w:ascii="Times New Roman" w:eastAsia="Times New Roman" w:hAnsi="Times New Roman" w:cs="Times New Roman"/>
+                <w:b/>
+                <w:bCs/>
                 <w:sz w:val="24"/>
                 <w:szCs w:val="24"/>
               </w:rPr>
@@ -16886,6 +16922,8 @@
               <w:spacing w:line="240" w:lineRule="auto"/>
               <w:rPr>
                 <w:rFonts w:ascii="Times New Roman" w:eastAsia="Times New Roman" w:hAnsi="Times New Roman" w:cs="Times New Roman"/>
+                <w:b/>
+                <w:bCs/>
                 <w:sz w:val="24"/>
                 <w:szCs w:val="24"/>
               </w:rPr>
@@ -16893,6 +16931,8 @@
             <w:r>
               <w:rPr>
                 <w:rFonts w:ascii="Times New Roman" w:eastAsia="Times New Roman" w:hAnsi="Times New Roman" w:cs="Times New Roman"/>
+                <w:b/>
+                <w:bCs/>
                 <w:sz w:val="24"/>
                 <w:szCs w:val="24"/>
               </w:rPr>
@@ -16902,6 +16942,8 @@
             <w:r>
               <w:rPr>
                 <w:rFonts w:ascii="Times New Roman" w:eastAsia="Times New Roman" w:hAnsi="Times New Roman" w:cs="Times New Roman"/>
+                <w:b/>
+                <w:bCs/>
                 <w:sz w:val="24"/>
                 <w:szCs w:val="24"/>
               </w:rPr>
@@ -16911,6 +16953,8 @@
             <w:r>
               <w:rPr>
                 <w:rFonts w:ascii="Times New Roman" w:eastAsia="Times New Roman" w:hAnsi="Times New Roman" w:cs="Times New Roman"/>
+                <w:b/>
+                <w:bCs/>
                 <w:sz w:val="24"/>
                 <w:szCs w:val="24"/>
               </w:rPr>
@@ -17703,6 +17747,8 @@
               <w:spacing w:line="240" w:lineRule="auto"/>
               <w:rPr>
                 <w:rFonts w:ascii="Times New Roman" w:eastAsia="Times New Roman" w:hAnsi="Times New Roman" w:cs="Times New Roman"/>
+                <w:b/>
+                <w:bCs/>
                 <w:sz w:val="24"/>
                 <w:szCs w:val="24"/>
               </w:rPr>
@@ -17712,6 +17758,8 @@
             <w:r>
               <w:rPr>
                 <w:rFonts w:ascii="Times New Roman" w:eastAsia="Times New Roman" w:hAnsi="Times New Roman" w:cs="Times New Roman"/>
+                <w:b/>
+                <w:bCs/>
                 <w:sz w:val="24"/>
                 <w:szCs w:val="24"/>
               </w:rPr>
@@ -17721,6 +17769,8 @@
             <w:r>
               <w:rPr>
                 <w:rFonts w:ascii="Times New Roman" w:eastAsia="Times New Roman" w:hAnsi="Times New Roman" w:cs="Times New Roman"/>
+                <w:b/>
+                <w:bCs/>
                 <w:sz w:val="24"/>
                 <w:szCs w:val="24"/>
               </w:rPr>
@@ -17730,6 +17780,8 @@
             <w:r>
               <w:rPr>
                 <w:rFonts w:ascii="Times New Roman" w:eastAsia="Times New Roman" w:hAnsi="Times New Roman" w:cs="Times New Roman"/>
+                <w:b/>
+                <w:bCs/>
                 <w:sz w:val="24"/>
                 <w:szCs w:val="24"/>
               </w:rPr>
@@ -17739,6 +17791,8 @@
             <w:r>
               <w:rPr>
                 <w:rFonts w:ascii="Times New Roman" w:eastAsia="Times New Roman" w:hAnsi="Times New Roman" w:cs="Times New Roman"/>
+                <w:b/>
+                <w:bCs/>
                 <w:sz w:val="24"/>
                 <w:szCs w:val="24"/>
               </w:rPr>
@@ -17748,6 +17802,8 @@
             <w:r>
               <w:rPr>
                 <w:rFonts w:ascii="Times New Roman" w:eastAsia="Times New Roman" w:hAnsi="Times New Roman" w:cs="Times New Roman"/>
+                <w:b/>
+                <w:bCs/>
                 <w:sz w:val="24"/>
                 <w:szCs w:val="24"/>
               </w:rPr>

</xml_diff>